<commit_message>
TTE : update tte dengan template menggunakan generate pdf dari docx
</commit_message>
<xml_diff>
--- a/public/templates/SKBN.docx
+++ b/public/templates/SKBN.docx
@@ -2213,8 +2213,8 @@
       </w:tblPr>
       <w:tblGrid>
         <w:gridCol w:w="2403"/>
-        <w:gridCol w:w="3561"/>
-        <w:gridCol w:w="3441"/>
+        <w:gridCol w:w="2937"/>
+        <w:gridCol w:w="4065"/>
       </w:tblGrid>
       <w:tr>
         <w:tblPrEx>
@@ -2260,7 +2260,7 @@
         </w:tc>
         <w:tc>
           <w:tcPr>
-            <w:tcW w:w="3561" w:type="dxa"/>
+            <w:tcW w:w="2937" w:type="dxa"/>
           </w:tcPr>
           <w:p>
             <w:pPr>
@@ -2282,7 +2282,7 @@
         </w:tc>
         <w:tc>
           <w:tcPr>
-            <w:tcW w:w="3441" w:type="dxa"/>
+            <w:tcW w:w="4065" w:type="dxa"/>
             <w:shd w:val="clear" w:color="auto" w:fill="auto"/>
             <w:vAlign w:val="top"/>
           </w:tcPr>
@@ -2356,20 +2356,7 @@
                 <w:lang w:val="en-US" w:eastAsia="zh-CN" w:bidi="ar-SA"/>
               </w:rPr>
             </w:pPr>
-          </w:p>
-        </w:tc>
-        <w:tc>
-          <w:tcPr>
-            <w:tcW w:w="3561" w:type="dxa"/>
-          </w:tcPr>
-          <w:p>
-            <w:pPr>
-              <w:widowControl w:val="0"/>
-              <w:numPr>
-                <w:ilvl w:val="0"/>
-                <w:numId w:val="0"/>
-              </w:numPr>
-              <w:jc w:val="both"/>
+            <w:r>
               <w:rPr>
                 <w:rFonts w:hint="default" w:ascii="Arial" w:hAnsi="Arial"/>
                 <w:sz w:val="22"/>
@@ -2377,12 +2364,35 @@
                 <w:vertAlign w:val="baseline"/>
                 <w:lang w:val="en-US"/>
               </w:rPr>
-            </w:pPr>
-          </w:p>
-        </w:tc>
-        <w:tc>
-          <w:tcPr>
-            <w:tcW w:w="3441" w:type="dxa"/>
+              <w:t>Pemohon</w:t>
+            </w:r>
+          </w:p>
+        </w:tc>
+        <w:tc>
+          <w:tcPr>
+            <w:tcW w:w="2937" w:type="dxa"/>
+          </w:tcPr>
+          <w:p>
+            <w:pPr>
+              <w:widowControl w:val="0"/>
+              <w:numPr>
+                <w:ilvl w:val="0"/>
+                <w:numId w:val="0"/>
+              </w:numPr>
+              <w:jc w:val="both"/>
+              <w:rPr>
+                <w:rFonts w:hint="default" w:ascii="Arial" w:hAnsi="Arial"/>
+                <w:sz w:val="22"/>
+                <w:szCs w:val="22"/>
+                <w:vertAlign w:val="baseline"/>
+                <w:lang w:val="en-US"/>
+              </w:rPr>
+            </w:pPr>
+          </w:p>
+        </w:tc>
+        <w:tc>
+          <w:tcPr>
+            <w:tcW w:w="4065" w:type="dxa"/>
             <w:shd w:val="clear" w:color="auto" w:fill="auto"/>
             <w:vAlign w:val="top"/>
           </w:tcPr>
@@ -2449,6 +2459,96 @@
               <w:ind w:left="0" w:leftChars="0" w:firstLine="0" w:firstLineChars="0"/>
               <w:jc w:val="left"/>
               <w:rPr>
+                <w:rFonts w:hint="default" w:ascii="Arial" w:hAnsi="Arial"/>
+                <w:sz w:val="22"/>
+                <w:szCs w:val="22"/>
+                <w:vertAlign w:val="baseline"/>
+                <w:lang w:val="en-US"/>
+              </w:rPr>
+            </w:pPr>
+          </w:p>
+          <w:p>
+            <w:pPr>
+              <w:widowControl w:val="0"/>
+              <w:numPr>
+                <w:ilvl w:val="0"/>
+                <w:numId w:val="0"/>
+              </w:numPr>
+              <w:ind w:left="0" w:leftChars="0" w:firstLine="0" w:firstLineChars="0"/>
+              <w:jc w:val="left"/>
+              <w:rPr>
+                <w:rFonts w:hint="default" w:ascii="Arial" w:hAnsi="Arial"/>
+                <w:sz w:val="22"/>
+                <w:szCs w:val="22"/>
+                <w:vertAlign w:val="baseline"/>
+                <w:lang w:val="en-US"/>
+              </w:rPr>
+            </w:pPr>
+          </w:p>
+          <w:p>
+            <w:pPr>
+              <w:widowControl w:val="0"/>
+              <w:numPr>
+                <w:ilvl w:val="0"/>
+                <w:numId w:val="0"/>
+              </w:numPr>
+              <w:ind w:left="0" w:leftChars="0" w:firstLine="0" w:firstLineChars="0"/>
+              <w:jc w:val="left"/>
+              <w:rPr>
+                <w:rFonts w:hint="default" w:ascii="Arial" w:hAnsi="Arial"/>
+                <w:sz w:val="22"/>
+                <w:szCs w:val="22"/>
+                <w:vertAlign w:val="baseline"/>
+                <w:lang w:val="en-US"/>
+              </w:rPr>
+            </w:pPr>
+          </w:p>
+          <w:p>
+            <w:pPr>
+              <w:widowControl w:val="0"/>
+              <w:numPr>
+                <w:ilvl w:val="0"/>
+                <w:numId w:val="0"/>
+              </w:numPr>
+              <w:ind w:left="0" w:leftChars="0" w:firstLine="0" w:firstLineChars="0"/>
+              <w:jc w:val="left"/>
+              <w:rPr>
+                <w:rFonts w:hint="default" w:ascii="Arial" w:hAnsi="Arial"/>
+                <w:sz w:val="22"/>
+                <w:szCs w:val="22"/>
+                <w:vertAlign w:val="baseline"/>
+                <w:lang w:val="en-US"/>
+              </w:rPr>
+            </w:pPr>
+          </w:p>
+          <w:p>
+            <w:pPr>
+              <w:widowControl w:val="0"/>
+              <w:numPr>
+                <w:ilvl w:val="0"/>
+                <w:numId w:val="0"/>
+              </w:numPr>
+              <w:ind w:left="0" w:leftChars="0" w:firstLine="0" w:firstLineChars="0"/>
+              <w:jc w:val="left"/>
+              <w:rPr>
+                <w:rFonts w:hint="default" w:ascii="Arial" w:hAnsi="Arial"/>
+                <w:sz w:val="22"/>
+                <w:szCs w:val="22"/>
+                <w:vertAlign w:val="baseline"/>
+                <w:lang w:val="en-US"/>
+              </w:rPr>
+            </w:pPr>
+          </w:p>
+          <w:p>
+            <w:pPr>
+              <w:widowControl w:val="0"/>
+              <w:numPr>
+                <w:ilvl w:val="0"/>
+                <w:numId w:val="0"/>
+              </w:numPr>
+              <w:ind w:left="0" w:leftChars="0" w:firstLine="0" w:firstLineChars="0"/>
+              <w:jc w:val="left"/>
+              <w:rPr>
                 <w:rFonts w:hint="default" w:ascii="Arial" w:hAnsi="Arial" w:eastAsiaTheme="minorEastAsia" w:cstheme="minorBidi"/>
                 <w:sz w:val="22"/>
                 <w:szCs w:val="22"/>
@@ -2464,22 +2564,22 @@
                 <w:vertAlign w:val="baseline"/>
                 <w:lang w:val="en-US"/>
               </w:rPr>
-              <w:t>Pemohon</w:t>
-            </w:r>
-          </w:p>
-        </w:tc>
-        <w:tc>
-          <w:tcPr>
-            <w:tcW w:w="3561" w:type="dxa"/>
-          </w:tcPr>
-          <w:p>
-            <w:pPr>
-              <w:widowControl w:val="0"/>
-              <w:numPr>
-                <w:ilvl w:val="0"/>
-                <w:numId w:val="0"/>
-              </w:numPr>
-              <w:jc w:val="both"/>
+              <w:t>${surat_nama}</w:t>
+            </w:r>
+          </w:p>
+        </w:tc>
+        <w:tc>
+          <w:tcPr>
+            <w:tcW w:w="2937" w:type="dxa"/>
+          </w:tcPr>
+          <w:p>
+            <w:pPr>
+              <w:widowControl w:val="0"/>
+              <w:numPr>
+                <w:ilvl w:val="0"/>
+                <w:numId w:val="0"/>
+              </w:numPr>
+              <w:jc w:val="center"/>
               <w:rPr>
                 <w:rFonts w:hint="default" w:ascii="Arial" w:hAnsi="Arial"/>
                 <w:sz w:val="22"/>
@@ -2488,11 +2588,38 @@
                 <w:lang w:val="en-US"/>
               </w:rPr>
             </w:pPr>
-          </w:p>
-        </w:tc>
-        <w:tc>
-          <w:tcPr>
-            <w:tcW w:w="3441" w:type="dxa"/>
+            <w:r>
+              <w:rPr>
+                <w:rFonts w:ascii="Arial" w:hAnsi="Arial" w:cs="Arial"/>
+                <w:sz w:val="22"/>
+                <w:szCs w:val="22"/>
+              </w:rPr>
+              <w:t>${</w:t>
+            </w:r>
+            <w:r>
+              <w:rPr>
+                <w:rFonts w:hint="default" w:ascii="Arial" w:hAnsi="Arial" w:cs="Arial"/>
+                <w:sz w:val="22"/>
+                <w:szCs w:val="22"/>
+                <w:lang w:val="en-US"/>
+              </w:rPr>
+              <w:t>qr</w:t>
+            </w:r>
+            <w:r>
+              <w:rPr>
+                <w:rFonts w:ascii="Arial" w:hAnsi="Arial" w:cs="Arial"/>
+                <w:sz w:val="22"/>
+                <w:szCs w:val="22"/>
+              </w:rPr>
+              <w:t>}</w:t>
+            </w:r>
+            <w:bookmarkStart w:id="0" w:name="_GoBack"/>
+            <w:bookmarkEnd w:id="0"/>
+          </w:p>
+        </w:tc>
+        <w:tc>
+          <w:tcPr>
+            <w:tcW w:w="4065" w:type="dxa"/>
             <w:shd w:val="clear" w:color="auto" w:fill="auto"/>
             <w:vAlign w:val="top"/>
           </w:tcPr>
@@ -2506,79 +2633,22 @@
               <w:ind w:left="0" w:leftChars="0" w:firstLine="0" w:firstLineChars="0"/>
               <w:jc w:val="both"/>
               <w:rPr>
-                <w:rFonts w:hint="default" w:ascii="Arial" w:hAnsi="Arial" w:eastAsiaTheme="minorEastAsia" w:cstheme="minorBidi"/>
-                <w:sz w:val="22"/>
-                <w:szCs w:val="22"/>
-                <w:vertAlign w:val="baseline"/>
-                <w:lang w:val="en-US" w:eastAsia="zh-CN" w:bidi="ar-SA"/>
-              </w:rPr>
-            </w:pPr>
-            <w:r>
-              <w:rPr>
                 <w:rFonts w:hint="default" w:ascii="Arial" w:hAnsi="Arial"/>
                 <w:sz w:val="22"/>
                 <w:szCs w:val="22"/>
                 <w:vertAlign w:val="baseline"/>
                 <w:lang w:val="en-US"/>
               </w:rPr>
-              <w:t>${skpd_jabatan}</w:t>
-            </w:r>
-          </w:p>
-        </w:tc>
-      </w:tr>
-      <w:tr>
-        <w:tblPrEx>
-          <w:tblBorders>
-            <w:top w:val="none" w:color="auto" w:sz="0" w:space="0"/>
-            <w:left w:val="none" w:color="auto" w:sz="0" w:space="0"/>
-            <w:bottom w:val="none" w:color="auto" w:sz="0" w:space="0"/>
-            <w:right w:val="none" w:color="auto" w:sz="0" w:space="0"/>
-            <w:insideH w:val="none" w:color="auto" w:sz="0" w:space="0"/>
-            <w:insideV w:val="none" w:color="auto" w:sz="0" w:space="0"/>
-          </w:tblBorders>
-          <w:tblCellMar>
-            <w:top w:w="0" w:type="dxa"/>
-            <w:left w:w="108" w:type="dxa"/>
-            <w:bottom w:w="0" w:type="dxa"/>
-            <w:right w:w="108" w:type="dxa"/>
-          </w:tblCellMar>
-        </w:tblPrEx>
-        <w:tc>
-          <w:tcPr>
-            <w:tcW w:w="2403" w:type="dxa"/>
-            <w:shd w:val="clear" w:color="auto" w:fill="auto"/>
-            <w:vAlign w:val="top"/>
-          </w:tcPr>
-          <w:p>
-            <w:pPr>
-              <w:widowControl w:val="0"/>
-              <w:numPr>
-                <w:ilvl w:val="0"/>
-                <w:numId w:val="0"/>
-              </w:numPr>
-              <w:ind w:left="0" w:leftChars="0" w:firstLine="0" w:firstLineChars="0"/>
-              <w:jc w:val="left"/>
-              <w:rPr>
-                <w:rFonts w:hint="default" w:ascii="Arial" w:hAnsi="Arial" w:eastAsiaTheme="minorEastAsia" w:cstheme="minorBidi"/>
-                <w:sz w:val="22"/>
-                <w:szCs w:val="22"/>
-                <w:vertAlign w:val="baseline"/>
-                <w:lang w:val="en-US" w:eastAsia="zh-CN" w:bidi="ar-SA"/>
-              </w:rPr>
-            </w:pPr>
-          </w:p>
-        </w:tc>
-        <w:tc>
-          <w:tcPr>
-            <w:tcW w:w="3561" w:type="dxa"/>
-          </w:tcPr>
-          <w:p>
-            <w:pPr>
-              <w:widowControl w:val="0"/>
-              <w:numPr>
-                <w:ilvl w:val="0"/>
-                <w:numId w:val="0"/>
-              </w:numPr>
+            </w:pPr>
+          </w:p>
+          <w:p>
+            <w:pPr>
+              <w:widowControl w:val="0"/>
+              <w:numPr>
+                <w:ilvl w:val="0"/>
+                <w:numId w:val="0"/>
+              </w:numPr>
+              <w:ind w:left="0" w:leftChars="0" w:firstLine="0" w:firstLineChars="0"/>
               <w:jc w:val="both"/>
               <w:rPr>
                 <w:rFonts w:hint="default" w:ascii="Arial" w:hAnsi="Arial"/>
@@ -2589,13 +2659,6 @@
               </w:rPr>
             </w:pPr>
           </w:p>
-        </w:tc>
-        <w:tc>
-          <w:tcPr>
-            <w:tcW w:w="3441" w:type="dxa"/>
-            <w:shd w:val="clear" w:color="auto" w:fill="auto"/>
-            <w:vAlign w:val="top"/>
-          </w:tcPr>
           <w:p>
             <w:pPr>
               <w:widowControl w:val="0"/>
@@ -2631,16 +2694,7 @@
                 <w:lang w:val="en-US"/>
               </w:rPr>
             </w:pPr>
-          </w:p>
-          <w:p>
-            <w:pPr>
-              <w:widowControl w:val="0"/>
-              <w:numPr>
-                <w:ilvl w:val="0"/>
-                <w:numId w:val="0"/>
-              </w:numPr>
-              <w:ind w:left="0" w:leftChars="0" w:firstLine="0" w:firstLineChars="0"/>
-              <w:jc w:val="both"/>
+            <w:r>
               <w:rPr>
                 <w:rFonts w:hint="default" w:ascii="Arial" w:hAnsi="Arial"/>
                 <w:sz w:val="22"/>
@@ -2648,7 +2702,8 @@
                 <w:vertAlign w:val="baseline"/>
                 <w:lang w:val="en-US"/>
               </w:rPr>
-            </w:pPr>
+              <w:t>[[qr_here]]</w:t>
+            </w:r>
           </w:p>
           <w:p>
             <w:pPr>
@@ -2667,265 +2722,24 @@
                 <w:lang w:val="en-US"/>
               </w:rPr>
             </w:pPr>
-            <w:r>
+          </w:p>
+          <w:p>
+            <w:pPr>
+              <w:widowControl w:val="0"/>
+              <w:numPr>
+                <w:ilvl w:val="0"/>
+                <w:numId w:val="0"/>
+              </w:numPr>
+              <w:ind w:left="0" w:leftChars="0" w:firstLine="0" w:firstLineChars="0"/>
+              <w:jc w:val="both"/>
               <w:rPr>
                 <w:rFonts w:hint="default" w:ascii="Arial" w:hAnsi="Arial"/>
                 <w:sz w:val="22"/>
                 <w:szCs w:val="22"/>
                 <w:vertAlign w:val="baseline"/>
-                <w:lang w:val="en-US"/>
-              </w:rPr>
-              <w:t>[[qr_here]]</w:t>
-            </w:r>
-          </w:p>
-          <w:p>
-            <w:pPr>
-              <w:widowControl w:val="0"/>
-              <w:numPr>
-                <w:ilvl w:val="0"/>
-                <w:numId w:val="0"/>
-              </w:numPr>
-              <w:ind w:left="0" w:leftChars="0" w:firstLine="0" w:firstLineChars="0"/>
-              <w:jc w:val="both"/>
-              <w:rPr>
-                <w:rFonts w:hint="default" w:ascii="Arial" w:hAnsi="Arial"/>
-                <w:sz w:val="22"/>
-                <w:szCs w:val="22"/>
-                <w:vertAlign w:val="baseline"/>
-                <w:lang w:val="en-US"/>
-              </w:rPr>
-            </w:pPr>
-          </w:p>
-          <w:p>
-            <w:pPr>
-              <w:widowControl w:val="0"/>
-              <w:numPr>
-                <w:ilvl w:val="0"/>
-                <w:numId w:val="0"/>
-              </w:numPr>
-              <w:ind w:left="0" w:leftChars="0" w:firstLine="0" w:firstLineChars="0"/>
-              <w:jc w:val="both"/>
-              <w:rPr>
-                <w:rFonts w:hint="default" w:ascii="Arial" w:hAnsi="Arial" w:eastAsiaTheme="minorEastAsia" w:cstheme="minorBidi"/>
-                <w:sz w:val="22"/>
-                <w:szCs w:val="22"/>
-                <w:vertAlign w:val="baseline"/>
-                <w:lang w:val="en-US" w:eastAsia="zh-CN" w:bidi="ar-SA"/>
-              </w:rPr>
-            </w:pPr>
-          </w:p>
-        </w:tc>
-      </w:tr>
-      <w:tr>
-        <w:tblPrEx>
-          <w:tblBorders>
-            <w:top w:val="none" w:color="auto" w:sz="0" w:space="0"/>
-            <w:left w:val="none" w:color="auto" w:sz="0" w:space="0"/>
-            <w:bottom w:val="none" w:color="auto" w:sz="0" w:space="0"/>
-            <w:right w:val="none" w:color="auto" w:sz="0" w:space="0"/>
-            <w:insideH w:val="none" w:color="auto" w:sz="0" w:space="0"/>
-            <w:insideV w:val="none" w:color="auto" w:sz="0" w:space="0"/>
-          </w:tblBorders>
-          <w:tblCellMar>
-            <w:top w:w="0" w:type="dxa"/>
-            <w:left w:w="108" w:type="dxa"/>
-            <w:bottom w:w="0" w:type="dxa"/>
-            <w:right w:w="108" w:type="dxa"/>
-          </w:tblCellMar>
-        </w:tblPrEx>
-        <w:tc>
-          <w:tcPr>
-            <w:tcW w:w="2403" w:type="dxa"/>
-            <w:shd w:val="clear" w:color="auto" w:fill="auto"/>
-            <w:vAlign w:val="top"/>
-          </w:tcPr>
-          <w:p>
-            <w:pPr>
-              <w:widowControl w:val="0"/>
-              <w:numPr>
-                <w:ilvl w:val="0"/>
-                <w:numId w:val="0"/>
-              </w:numPr>
-              <w:ind w:left="0" w:leftChars="0" w:firstLine="0" w:firstLineChars="0"/>
-              <w:jc w:val="left"/>
-              <w:rPr>
-                <w:rFonts w:hint="default" w:ascii="Arial" w:hAnsi="Arial" w:eastAsiaTheme="minorEastAsia" w:cstheme="minorBidi"/>
-                <w:sz w:val="22"/>
-                <w:szCs w:val="22"/>
-                <w:vertAlign w:val="baseline"/>
-                <w:lang w:val="en-US" w:eastAsia="zh-CN" w:bidi="ar-SA"/>
-              </w:rPr>
-            </w:pPr>
-            <w:r>
-              <w:rPr>
-                <w:rFonts w:hint="default" w:ascii="Arial" w:hAnsi="Arial"/>
-                <w:sz w:val="22"/>
-                <w:szCs w:val="22"/>
-                <w:vertAlign w:val="baseline"/>
-                <w:lang w:val="en-US"/>
-              </w:rPr>
-              <w:t>${surat_nama}</w:t>
-            </w:r>
-          </w:p>
-        </w:tc>
-        <w:tc>
-          <w:tcPr>
-            <w:tcW w:w="3561" w:type="dxa"/>
-          </w:tcPr>
-          <w:p>
-            <w:pPr>
-              <w:widowControl w:val="0"/>
-              <w:numPr>
-                <w:ilvl w:val="0"/>
-                <w:numId w:val="0"/>
-              </w:numPr>
-              <w:jc w:val="both"/>
-              <w:rPr>
-                <w:rFonts w:hint="default" w:ascii="Arial" w:hAnsi="Arial"/>
-                <w:sz w:val="22"/>
-                <w:szCs w:val="22"/>
-                <w:vertAlign w:val="baseline"/>
-                <w:lang w:val="en-US"/>
-              </w:rPr>
-            </w:pPr>
-          </w:p>
-        </w:tc>
-        <w:tc>
-          <w:tcPr>
-            <w:tcW w:w="3441" w:type="dxa"/>
-            <w:shd w:val="clear" w:color="auto" w:fill="auto"/>
-            <w:vAlign w:val="top"/>
-          </w:tcPr>
-          <w:p>
-            <w:pPr>
-              <w:widowControl w:val="0"/>
-              <w:numPr>
-                <w:ilvl w:val="0"/>
-                <w:numId w:val="0"/>
-              </w:numPr>
-              <w:ind w:left="0" w:leftChars="0" w:firstLine="0" w:firstLineChars="0"/>
-              <w:jc w:val="both"/>
-              <w:rPr>
-                <w:rFonts w:hint="default" w:ascii="Arial" w:hAnsi="Arial" w:eastAsiaTheme="minorEastAsia" w:cstheme="minorBidi"/>
-                <w:sz w:val="22"/>
-                <w:szCs w:val="22"/>
-                <w:vertAlign w:val="baseline"/>
-                <w:lang w:val="en-US" w:eastAsia="zh-CN" w:bidi="ar-SA"/>
-              </w:rPr>
-            </w:pPr>
-            <w:r>
-              <w:rPr>
-                <w:rFonts w:hint="default" w:ascii="Arial" w:hAnsi="Arial"/>
-                <w:b/>
-                <w:bCs/>
-                <w:sz w:val="22"/>
-                <w:szCs w:val="22"/>
-                <w:u w:val="single"/>
-                <w:vertAlign w:val="baseline"/>
-                <w:lang w:val="en-US"/>
-              </w:rPr>
-              <w:t>${skpd_kepala}</w:t>
-            </w:r>
-          </w:p>
-        </w:tc>
-      </w:tr>
-      <w:tr>
-        <w:tblPrEx>
-          <w:tblBorders>
-            <w:top w:val="none" w:color="auto" w:sz="0" w:space="0"/>
-            <w:left w:val="none" w:color="auto" w:sz="0" w:space="0"/>
-            <w:bottom w:val="none" w:color="auto" w:sz="0" w:space="0"/>
-            <w:right w:val="none" w:color="auto" w:sz="0" w:space="0"/>
-            <w:insideH w:val="none" w:color="auto" w:sz="0" w:space="0"/>
-            <w:insideV w:val="none" w:color="auto" w:sz="0" w:space="0"/>
-          </w:tblBorders>
-          <w:tblCellMar>
-            <w:top w:w="0" w:type="dxa"/>
-            <w:left w:w="108" w:type="dxa"/>
-            <w:bottom w:w="0" w:type="dxa"/>
-            <w:right w:w="108" w:type="dxa"/>
-          </w:tblCellMar>
-        </w:tblPrEx>
-        <w:tc>
-          <w:tcPr>
-            <w:tcW w:w="2403" w:type="dxa"/>
-            <w:shd w:val="clear" w:color="auto" w:fill="auto"/>
-            <w:vAlign w:val="top"/>
-          </w:tcPr>
-          <w:p>
-            <w:pPr>
-              <w:widowControl w:val="0"/>
-              <w:numPr>
-                <w:ilvl w:val="0"/>
-                <w:numId w:val="0"/>
-              </w:numPr>
-              <w:ind w:left="0" w:leftChars="0" w:firstLine="0" w:firstLineChars="0"/>
-              <w:jc w:val="left"/>
-              <w:rPr>
-                <w:rFonts w:hint="default" w:ascii="Arial" w:hAnsi="Arial" w:eastAsiaTheme="minorEastAsia" w:cstheme="minorBidi"/>
-                <w:sz w:val="22"/>
-                <w:szCs w:val="22"/>
-                <w:vertAlign w:val="baseline"/>
-                <w:lang w:val="en-US" w:eastAsia="zh-CN" w:bidi="ar-SA"/>
-              </w:rPr>
-            </w:pPr>
-          </w:p>
-        </w:tc>
-        <w:tc>
-          <w:tcPr>
-            <w:tcW w:w="3561" w:type="dxa"/>
-          </w:tcPr>
-          <w:p>
-            <w:pPr>
-              <w:widowControl w:val="0"/>
-              <w:numPr>
-                <w:ilvl w:val="0"/>
-                <w:numId w:val="0"/>
-              </w:numPr>
-              <w:jc w:val="both"/>
-              <w:rPr>
-                <w:rFonts w:hint="default" w:ascii="Arial" w:hAnsi="Arial"/>
-                <w:sz w:val="22"/>
-                <w:szCs w:val="22"/>
-                <w:vertAlign w:val="baseline"/>
-                <w:lang w:val="en-US"/>
-              </w:rPr>
-            </w:pPr>
-          </w:p>
-        </w:tc>
-        <w:tc>
-          <w:tcPr>
-            <w:tcW w:w="3441" w:type="dxa"/>
-            <w:shd w:val="clear" w:color="auto" w:fill="auto"/>
-            <w:vAlign w:val="top"/>
-          </w:tcPr>
-          <w:p>
-            <w:pPr>
-              <w:widowControl w:val="0"/>
-              <w:numPr>
-                <w:ilvl w:val="0"/>
-                <w:numId w:val="0"/>
-              </w:numPr>
-              <w:ind w:left="0" w:leftChars="0" w:firstLine="0" w:firstLineChars="0"/>
-              <w:jc w:val="both"/>
-              <w:rPr>
-                <w:rFonts w:hint="default" w:ascii="Arial" w:hAnsi="Arial" w:eastAsiaTheme="minorEastAsia" w:cstheme="minorBidi"/>
-                <w:sz w:val="22"/>
-                <w:szCs w:val="22"/>
-                <w:vertAlign w:val="baseline"/>
-                <w:lang w:val="en-US" w:eastAsia="zh-CN" w:bidi="ar-SA"/>
-              </w:rPr>
-            </w:pPr>
-            <w:r>
-              <w:rPr>
-                <w:rFonts w:hint="default" w:ascii="Arial" w:hAnsi="Arial"/>
-                <w:sz w:val="22"/>
-                <w:szCs w:val="22"/>
-                <w:vertAlign w:val="baseline"/>
-                <w:lang w:val="en-US"/>
-              </w:rPr>
-              <w:t>NIP. ${skpd_nip_kepala}</w:t>
-            </w:r>
+                <w:lang w:val="en-US" w:eastAsia="zh-CN"/>
+              </w:rPr>
+            </w:pPr>
           </w:p>
         </w:tc>
       </w:tr>
@@ -2945,8 +2759,6 @@
           <w:lang w:val="en-US"/>
         </w:rPr>
       </w:pPr>
-      <w:bookmarkStart w:id="0" w:name="_GoBack"/>
-      <w:bookmarkEnd w:id="0"/>
     </w:p>
     <w:sectPr>
       <w:headerReference r:id="rId3" w:type="default"/>
@@ -3647,7 +3459,7 @@
     <w:lsdException w:qFormat="1" w:unhideWhenUsed="0" w:uiPriority="0" w:semiHidden="0" w:name="Title"/>
     <w:lsdException w:unhideWhenUsed="0" w:uiPriority="0" w:semiHidden="0" w:name="Closing"/>
     <w:lsdException w:unhideWhenUsed="0" w:uiPriority="0" w:semiHidden="0" w:name="Signature"/>
-    <w:lsdException w:unhideWhenUsed="0" w:uiPriority="0" w:name="Default Paragraph Font"/>
+    <w:lsdException w:qFormat="1" w:unhideWhenUsed="0" w:uiPriority="0" w:name="Default Paragraph Font"/>
     <w:lsdException w:unhideWhenUsed="0" w:uiPriority="0" w:semiHidden="0" w:name="Body Text"/>
     <w:lsdException w:unhideWhenUsed="0" w:uiPriority="0" w:semiHidden="0" w:name="Body Text Indent"/>
     <w:lsdException w:unhideWhenUsed="0" w:uiPriority="0" w:semiHidden="0" w:name="List Continue"/>
@@ -3736,7 +3548,7 @@
     <w:lsdException w:unhideWhenUsed="0" w:uiPriority="61" w:semiHidden="0" w:name="Light List"/>
     <w:lsdException w:unhideWhenUsed="0" w:uiPriority="62" w:semiHidden="0" w:name="Light Grid"/>
     <w:lsdException w:unhideWhenUsed="0" w:uiPriority="63" w:semiHidden="0" w:name="Medium Shading 1"/>
-    <w:lsdException w:unhideWhenUsed="0" w:uiPriority="64" w:semiHidden="0" w:name="Medium Shading 2"/>
+    <w:lsdException w:qFormat="1" w:unhideWhenUsed="0" w:uiPriority="64" w:semiHidden="0" w:name="Medium Shading 2"/>
     <w:lsdException w:unhideWhenUsed="0" w:uiPriority="65" w:semiHidden="0" w:name="Medium List 1"/>
     <w:lsdException w:unhideWhenUsed="0" w:uiPriority="66" w:semiHidden="0" w:name="Medium List 2"/>
     <w:lsdException w:unhideWhenUsed="0" w:uiPriority="67" w:semiHidden="0" w:name="Medium Grid 1"/>
@@ -3748,7 +3560,7 @@
     <w:lsdException w:unhideWhenUsed="0" w:uiPriority="73" w:semiHidden="0" w:name="Colorful Grid"/>
     <w:lsdException w:unhideWhenUsed="0" w:uiPriority="60" w:semiHidden="0" w:name="Light Shading Accent 1"/>
     <w:lsdException w:unhideWhenUsed="0" w:uiPriority="61" w:semiHidden="0" w:name="Light List Accent 1"/>
-    <w:lsdException w:unhideWhenUsed="0" w:uiPriority="62" w:semiHidden="0" w:name="Light Grid Accent 1"/>
+    <w:lsdException w:qFormat="1" w:unhideWhenUsed="0" w:uiPriority="62" w:semiHidden="0" w:name="Light Grid Accent 1"/>
     <w:lsdException w:unhideWhenUsed="0" w:uiPriority="63" w:semiHidden="0" w:name="Medium Shading 1 Accent 1"/>
     <w:lsdException w:unhideWhenUsed="0" w:uiPriority="64" w:semiHidden="0" w:name="Medium Shading 2 Accent 1"/>
     <w:lsdException w:unhideWhenUsed="0" w:uiPriority="65" w:semiHidden="0" w:name="Medium List 1 Accent 1"/>
@@ -3760,11 +3572,11 @@
     <w:lsdException w:unhideWhenUsed="0" w:uiPriority="71" w:semiHidden="0" w:name="Colorful Shading Accent 1"/>
     <w:lsdException w:unhideWhenUsed="0" w:uiPriority="72" w:semiHidden="0" w:name="Colorful List Accent 1"/>
     <w:lsdException w:unhideWhenUsed="0" w:uiPriority="73" w:semiHidden="0" w:name="Colorful Grid Accent 1"/>
-    <w:lsdException w:unhideWhenUsed="0" w:uiPriority="60" w:semiHidden="0" w:name="Light Shading Accent 2"/>
+    <w:lsdException w:qFormat="1" w:unhideWhenUsed="0" w:uiPriority="60" w:semiHidden="0" w:name="Light Shading Accent 2"/>
     <w:lsdException w:unhideWhenUsed="0" w:uiPriority="61" w:semiHidden="0" w:name="Light List Accent 2"/>
-    <w:lsdException w:unhideWhenUsed="0" w:uiPriority="62" w:semiHidden="0" w:name="Light Grid Accent 2"/>
+    <w:lsdException w:qFormat="1" w:unhideWhenUsed="0" w:uiPriority="62" w:semiHidden="0" w:name="Light Grid Accent 2"/>
     <w:lsdException w:unhideWhenUsed="0" w:uiPriority="63" w:semiHidden="0" w:name="Medium Shading 1 Accent 2"/>
-    <w:lsdException w:unhideWhenUsed="0" w:uiPriority="64" w:semiHidden="0" w:name="Medium Shading 2 Accent 2"/>
+    <w:lsdException w:qFormat="1" w:unhideWhenUsed="0" w:uiPriority="64" w:semiHidden="0" w:name="Medium Shading 2 Accent 2"/>
     <w:lsdException w:unhideWhenUsed="0" w:uiPriority="65" w:semiHidden="0" w:name="Medium List 1 Accent 2"/>
     <w:lsdException w:unhideWhenUsed="0" w:uiPriority="66" w:semiHidden="0" w:name="Medium List 2 Accent 2"/>
     <w:lsdException w:unhideWhenUsed="0" w:uiPriority="67" w:semiHidden="0" w:name="Medium Grid 1 Accent 2"/>
@@ -3774,10 +3586,10 @@
     <w:lsdException w:unhideWhenUsed="0" w:uiPriority="71" w:semiHidden="0" w:name="Colorful Shading Accent 2"/>
     <w:lsdException w:unhideWhenUsed="0" w:uiPriority="72" w:semiHidden="0" w:name="Colorful List Accent 2"/>
     <w:lsdException w:unhideWhenUsed="0" w:uiPriority="73" w:semiHidden="0" w:name="Colorful Grid Accent 2"/>
-    <w:lsdException w:unhideWhenUsed="0" w:uiPriority="60" w:semiHidden="0" w:name="Light Shading Accent 3"/>
+    <w:lsdException w:qFormat="1" w:unhideWhenUsed="0" w:uiPriority="60" w:semiHidden="0" w:name="Light Shading Accent 3"/>
     <w:lsdException w:unhideWhenUsed="0" w:uiPriority="61" w:semiHidden="0" w:name="Light List Accent 3"/>
     <w:lsdException w:unhideWhenUsed="0" w:uiPriority="62" w:semiHidden="0" w:name="Light Grid Accent 3"/>
-    <w:lsdException w:unhideWhenUsed="0" w:uiPriority="63" w:semiHidden="0" w:name="Medium Shading 1 Accent 3"/>
+    <w:lsdException w:qFormat="1" w:unhideWhenUsed="0" w:uiPriority="63" w:semiHidden="0" w:name="Medium Shading 1 Accent 3"/>
     <w:lsdException w:unhideWhenUsed="0" w:uiPriority="64" w:semiHidden="0" w:name="Medium Shading 2 Accent 3"/>
     <w:lsdException w:unhideWhenUsed="0" w:uiPriority="65" w:semiHidden="0" w:name="Medium List 1 Accent 3"/>
     <w:lsdException w:unhideWhenUsed="0" w:uiPriority="66" w:semiHidden="0" w:name="Medium List 2 Accent 3"/>
@@ -3789,7 +3601,7 @@
     <w:lsdException w:unhideWhenUsed="0" w:uiPriority="72" w:semiHidden="0" w:name="Colorful List Accent 3"/>
     <w:lsdException w:unhideWhenUsed="0" w:uiPriority="73" w:semiHidden="0" w:name="Colorful Grid Accent 3"/>
     <w:lsdException w:unhideWhenUsed="0" w:uiPriority="60" w:semiHidden="0" w:name="Light Shading Accent 4"/>
-    <w:lsdException w:unhideWhenUsed="0" w:uiPriority="61" w:semiHidden="0" w:name="Light List Accent 4"/>
+    <w:lsdException w:qFormat="1" w:unhideWhenUsed="0" w:uiPriority="61" w:semiHidden="0" w:name="Light List Accent 4"/>
     <w:lsdException w:unhideWhenUsed="0" w:uiPriority="62" w:semiHidden="0" w:name="Light Grid Accent 4"/>
     <w:lsdException w:unhideWhenUsed="0" w:uiPriority="63" w:semiHidden="0" w:name="Medium Shading 1 Accent 4"/>
     <w:lsdException w:unhideWhenUsed="0" w:uiPriority="64" w:semiHidden="0" w:name="Medium Shading 2 Accent 4"/>
@@ -3816,7 +3628,7 @@
     <w:lsdException w:unhideWhenUsed="0" w:uiPriority="71" w:semiHidden="0" w:name="Colorful Shading Accent 5"/>
     <w:lsdException w:unhideWhenUsed="0" w:uiPriority="72" w:semiHidden="0" w:name="Colorful List Accent 5"/>
     <w:lsdException w:unhideWhenUsed="0" w:uiPriority="73" w:semiHidden="0" w:name="Colorful Grid Accent 5"/>
-    <w:lsdException w:unhideWhenUsed="0" w:uiPriority="60" w:semiHidden="0" w:name="Light Shading Accent 6"/>
+    <w:lsdException w:qFormat="1" w:unhideWhenUsed="0" w:uiPriority="60" w:semiHidden="0" w:name="Light Shading Accent 6"/>
     <w:lsdException w:unhideWhenUsed="0" w:uiPriority="61" w:semiHidden="0" w:name="Light List Accent 6"/>
     <w:lsdException w:unhideWhenUsed="0" w:uiPriority="62" w:semiHidden="0" w:name="Light Grid Accent 6"/>
     <w:lsdException w:unhideWhenUsed="0" w:uiPriority="63" w:semiHidden="0" w:name="Medium Shading 1 Accent 6"/>
@@ -3843,6 +3655,7 @@
   <w:style w:type="character" w:default="1" w:styleId="2">
     <w:name w:val="Default Paragraph Font"/>
     <w:semiHidden/>
+    <w:qFormat/>
     <w:uiPriority w:val="0"/>
   </w:style>
   <w:style w:type="table" w:default="1" w:styleId="3">

</xml_diff>

<commit_message>
Insert Form Warga admin
</commit_message>
<xml_diff>
--- a/public/templates/SKBN.docx
+++ b/public/templates/SKBN.docx
@@ -1,6 +1,6 @@
 
 <file path=word/document.xml><?xml version="1.0" encoding="utf-8"?>
-<w:document xmlns:wpc="http://schemas.microsoft.com/office/word/2010/wordprocessingCanvas" xmlns:cx="http://schemas.microsoft.com/office/drawing/2014/chartex" xmlns:cx1="http://schemas.microsoft.com/office/drawing/2015/9/8/chartex" xmlns:cx2="http://schemas.microsoft.com/office/drawing/2015/10/21/chartex" xmlns:cx3="http://schemas.microsoft.com/office/drawing/2016/5/9/chartex" xmlns:cx4="http://schemas.microsoft.com/office/drawing/2016/5/10/chartex" xmlns:cx5="http://schemas.microsoft.com/office/drawing/2016/5/11/chartex" xmlns:cx6="http://schemas.microsoft.com/office/drawing/2016/5/12/chartex" xmlns:cx7="http://schemas.microsoft.com/office/drawing/2016/5/13/chartex" xmlns:cx8="http://schemas.microsoft.com/office/drawing/2016/5/14/chartex" xmlns:mc="http://schemas.openxmlformats.org/markup-compatibility/2006" xmlns:aink="http://schemas.microsoft.com/office/drawing/2016/ink" xmlns:am3d="http://schemas.microsoft.com/office/drawing/2017/model3d" xmlns:o="urn:schemas-microsoft-com:office:office" xmlns:oel="http://schemas.microsoft.com/office/2019/extlst" xmlns:r="http://schemas.openxmlformats.org/officeDocument/2006/relationships" xmlns:m="http://schemas.openxmlformats.org/officeDocument/2006/math" xmlns:v="urn:schemas-microsoft-com:vml" xmlns:wp14="http://schemas.microsoft.com/office/word/2010/wordprocessingDrawing" xmlns:wp="http://schemas.openxmlformats.org/drawingml/2006/wordprocessingDrawing" xmlns:w10="urn:schemas-microsoft-com:office:word" xmlns:w="http://schemas.openxmlformats.org/wordprocessingml/2006/main" xmlns:w14="http://schemas.microsoft.com/office/word/2010/wordml" xmlns:w15="http://schemas.microsoft.com/office/word/2012/wordml" xmlns:w16cex="http://schemas.microsoft.com/office/word/2018/wordml/cex" xmlns:w16cid="http://schemas.microsoft.com/office/word/2016/wordml/cid" xmlns:w16="http://schemas.microsoft.com/office/word/2018/wordml" xmlns:w16du="http://schemas.microsoft.com/office/word/2023/wordml/word16du" xmlns:w16sdtdh="http://schemas.microsoft.com/office/word/2020/wordml/sdtdatahash" xmlns:w16sdtfl="http://schemas.microsoft.com/office/word/2024/wordml/sdtformatlock" xmlns:w16se="http://schemas.microsoft.com/office/word/2015/wordml/symex" xmlns:wpg="http://schemas.microsoft.com/office/word/2010/wordprocessingGroup" xmlns:wpi="http://schemas.microsoft.com/office/word/2010/wordprocessingInk" xmlns:wne="http://schemas.microsoft.com/office/word/2006/wordml" xmlns:wps="http://schemas.microsoft.com/office/word/2010/wordprocessingShape" mc:Ignorable="w14 w15 w16se w16cid w16 w16cex w16sdtdh w16sdtfl w16du wp14">
+<w:document xmlns:wpc="http://schemas.microsoft.com/office/word/2010/wordprocessingCanvas" xmlns:mc="http://schemas.openxmlformats.org/markup-compatibility/2006" xmlns:o="urn:schemas-microsoft-com:office:office" xmlns:r="http://schemas.openxmlformats.org/officeDocument/2006/relationships" xmlns:m="http://schemas.openxmlformats.org/officeDocument/2006/math" xmlns:v="urn:schemas-microsoft-com:vml" xmlns:wp14="http://schemas.microsoft.com/office/word/2010/wordprocessingDrawing" xmlns:wp="http://schemas.openxmlformats.org/drawingml/2006/wordprocessingDrawing" xmlns:w10="urn:schemas-microsoft-com:office:word" xmlns:w="http://schemas.openxmlformats.org/wordprocessingml/2006/main" xmlns:w14="http://schemas.microsoft.com/office/word/2010/wordml" xmlns:w15="http://schemas.microsoft.com/office/word/2012/wordml" xmlns:wpg="http://schemas.microsoft.com/office/word/2010/wordprocessingGroup" xmlns:wpi="http://schemas.microsoft.com/office/word/2010/wordprocessingInk" xmlns:wne="http://schemas.microsoft.com/office/word/2006/wordml" xmlns:wps="http://schemas.microsoft.com/office/word/2010/wordprocessingShape" mc:Ignorable="w14 w15 wp14">
   <w:body>
     <w:p>
       <w:pPr>
@@ -172,7 +172,6 @@
         <w:t xml:space="preserve"> </w:t>
       </w:r>
       <w:proofErr w:type="spellStart"/>
-      <w:proofErr w:type="gramStart"/>
       <w:r>
         <w:rPr>
           <w:rFonts w:ascii="Arial" w:hAnsi="Arial" w:cs="Arial"/>
@@ -190,7 +189,6 @@
         </w:rPr>
         <w:t xml:space="preserve"> :</w:t>
       </w:r>
-      <w:proofErr w:type="gramEnd"/>
     </w:p>
     <w:tbl>
       <w:tblPr>
@@ -843,8 +841,18 @@
                 <w:sz w:val="22"/>
                 <w:szCs w:val="22"/>
               </w:rPr>
-              <w:t xml:space="preserve"> Lahir</w:t>
-            </w:r>
+              <w:t xml:space="preserve"> </w:t>
+            </w:r>
+            <w:proofErr w:type="spellStart"/>
+            <w:r>
+              <w:rPr>
+                <w:rFonts w:ascii="Arial" w:hAnsi="Arial" w:cs="Arial"/>
+                <w:sz w:val="22"/>
+                <w:szCs w:val="22"/>
+              </w:rPr>
+              <w:t>Lahir</w:t>
+            </w:r>
+            <w:proofErr w:type="spellEnd"/>
           </w:p>
         </w:tc>
         <w:tc>
@@ -1387,13 +1395,23 @@
                 <w:szCs w:val="22"/>
               </w:rPr>
             </w:pPr>
-            <w:r>
-              <w:rPr>
-                <w:rFonts w:ascii="Arial" w:hAnsi="Arial" w:cs="Arial"/>
-                <w:sz w:val="22"/>
-                <w:szCs w:val="22"/>
-              </w:rPr>
-              <w:t xml:space="preserve">Pendidikan </w:t>
+            <w:proofErr w:type="spellStart"/>
+            <w:r>
+              <w:rPr>
+                <w:rFonts w:ascii="Arial" w:hAnsi="Arial" w:cs="Arial"/>
+                <w:sz w:val="22"/>
+                <w:szCs w:val="22"/>
+              </w:rPr>
+              <w:t>Pendidikan</w:t>
+            </w:r>
+            <w:proofErr w:type="spellEnd"/>
+            <w:r>
+              <w:rPr>
+                <w:rFonts w:ascii="Arial" w:hAnsi="Arial" w:cs="Arial"/>
+                <w:sz w:val="22"/>
+                <w:szCs w:val="22"/>
+              </w:rPr>
+              <w:t xml:space="preserve"> </w:t>
             </w:r>
             <w:proofErr w:type="spellStart"/>
             <w:r>
@@ -1501,14 +1519,6 @@
                 <w:szCs w:val="22"/>
               </w:rPr>
             </w:pPr>
-            <w:r>
-              <w:rPr>
-                <w:rFonts w:ascii="Arial" w:hAnsi="Arial" w:cs="Arial"/>
-                <w:sz w:val="22"/>
-                <w:szCs w:val="22"/>
-              </w:rPr>
-              <w:t xml:space="preserve">Alamat </w:t>
-            </w:r>
             <w:proofErr w:type="spellStart"/>
             <w:r>
               <w:rPr>
@@ -1516,6 +1526,24 @@
                 <w:sz w:val="22"/>
                 <w:szCs w:val="22"/>
               </w:rPr>
+              <w:t>Alamat</w:t>
+            </w:r>
+            <w:proofErr w:type="spellEnd"/>
+            <w:r>
+              <w:rPr>
+                <w:rFonts w:ascii="Arial" w:hAnsi="Arial" w:cs="Arial"/>
+                <w:sz w:val="22"/>
+                <w:szCs w:val="22"/>
+              </w:rPr>
+              <w:t xml:space="preserve"> </w:t>
+            </w:r>
+            <w:proofErr w:type="spellStart"/>
+            <w:r>
+              <w:rPr>
+                <w:rFonts w:ascii="Arial" w:hAnsi="Arial" w:cs="Arial"/>
+                <w:sz w:val="22"/>
+                <w:szCs w:val="22"/>
+              </w:rPr>
               <w:t>Tempat</w:t>
             </w:r>
             <w:proofErr w:type="spellEnd"/>
@@ -1525,8 +1553,18 @@
                 <w:sz w:val="22"/>
                 <w:szCs w:val="22"/>
               </w:rPr>
-              <w:t xml:space="preserve"> Tinggal</w:t>
-            </w:r>
+              <w:t xml:space="preserve"> </w:t>
+            </w:r>
+            <w:proofErr w:type="spellStart"/>
+            <w:r>
+              <w:rPr>
+                <w:rFonts w:ascii="Arial" w:hAnsi="Arial" w:cs="Arial"/>
+                <w:sz w:val="22"/>
+                <w:szCs w:val="22"/>
+              </w:rPr>
+              <w:t>Tinggal</w:t>
+            </w:r>
+            <w:proofErr w:type="spellEnd"/>
           </w:p>
         </w:tc>
         <w:tc>
@@ -1787,7 +1825,6 @@
         <w:t xml:space="preserve"> </w:t>
       </w:r>
       <w:proofErr w:type="spellStart"/>
-      <w:proofErr w:type="gramStart"/>
       <w:r>
         <w:rPr>
           <w:rFonts w:ascii="Arial" w:hAnsi="Arial" w:cs="Arial"/>
@@ -1805,7 +1842,6 @@
         </w:rPr>
         <w:t xml:space="preserve"> :</w:t>
       </w:r>
-      <w:proofErr w:type="gramEnd"/>
     </w:p>
     <w:tbl>
       <w:tblPr>
@@ -2221,10 +2257,12 @@
         <w:tc>
           <w:tcPr>
             <w:tcW w:w="2403" w:type="dxa"/>
-          </w:tcPr>
-          <w:p>
-            <w:pPr>
-              <w:jc w:val="left"/>
+            <w:shd w:val="clear" w:color="auto" w:fill="auto"/>
+            <w:vAlign w:val="center"/>
+          </w:tcPr>
+          <w:p>
+            <w:pPr>
+              <w:jc w:val="center"/>
               <w:rPr>
                 <w:rFonts w:ascii="Arial" w:hAnsi="Arial"/>
                 <w:sz w:val="22"/>
@@ -2236,9 +2274,11 @@
         <w:tc>
           <w:tcPr>
             <w:tcW w:w="2937" w:type="dxa"/>
-          </w:tcPr>
-          <w:p>
-            <w:pPr>
+            <w:vAlign w:val="center"/>
+          </w:tcPr>
+          <w:p>
+            <w:pPr>
+              <w:jc w:val="center"/>
               <w:rPr>
                 <w:rFonts w:ascii="Arial" w:hAnsi="Arial"/>
                 <w:sz w:val="22"/>
@@ -2250,9 +2290,12 @@
         <w:tc>
           <w:tcPr>
             <w:tcW w:w="4065" w:type="dxa"/>
-          </w:tcPr>
-          <w:p>
-            <w:pPr>
+            <w:shd w:val="clear" w:color="auto" w:fill="auto"/>
+            <w:vAlign w:val="center"/>
+          </w:tcPr>
+          <w:p>
+            <w:pPr>
+              <w:jc w:val="center"/>
               <w:rPr>
                 <w:rFonts w:ascii="Arial" w:hAnsi="Arial"/>
                 <w:sz w:val="22"/>
@@ -2292,10 +2335,12 @@
         <w:tc>
           <w:tcPr>
             <w:tcW w:w="2403" w:type="dxa"/>
-          </w:tcPr>
-          <w:p>
-            <w:pPr>
-              <w:jc w:val="left"/>
+            <w:shd w:val="clear" w:color="auto" w:fill="auto"/>
+            <w:vAlign w:val="center"/>
+          </w:tcPr>
+          <w:p>
+            <w:pPr>
+              <w:jc w:val="center"/>
               <w:rPr>
                 <w:rFonts w:ascii="Arial" w:hAnsi="Arial"/>
                 <w:sz w:val="22"/>
@@ -2317,9 +2362,11 @@
         <w:tc>
           <w:tcPr>
             <w:tcW w:w="2937" w:type="dxa"/>
-          </w:tcPr>
-          <w:p>
-            <w:pPr>
+            <w:vAlign w:val="center"/>
+          </w:tcPr>
+          <w:p>
+            <w:pPr>
+              <w:jc w:val="center"/>
               <w:rPr>
                 <w:rFonts w:ascii="Arial" w:hAnsi="Arial"/>
                 <w:sz w:val="22"/>
@@ -2331,9 +2378,12 @@
         <w:tc>
           <w:tcPr>
             <w:tcW w:w="4065" w:type="dxa"/>
-          </w:tcPr>
-          <w:p>
-            <w:pPr>
+            <w:shd w:val="clear" w:color="auto" w:fill="auto"/>
+            <w:vAlign w:val="center"/>
+          </w:tcPr>
+          <w:p>
+            <w:pPr>
+              <w:jc w:val="center"/>
               <w:rPr>
                 <w:rFonts w:ascii="Arial" w:hAnsi="Arial"/>
                 <w:sz w:val="22"/>
@@ -2365,7 +2415,39 @@
         <w:tc>
           <w:tcPr>
             <w:tcW w:w="2403" w:type="dxa"/>
-          </w:tcPr>
+            <w:shd w:val="clear" w:color="auto" w:fill="auto"/>
+            <w:vAlign w:val="center"/>
+          </w:tcPr>
+          <w:p>
+            <w:pPr>
+              <w:jc w:val="center"/>
+              <w:rPr>
+                <w:rFonts w:ascii="Arial" w:hAnsi="Arial"/>
+                <w:sz w:val="22"/>
+                <w:szCs w:val="22"/>
+              </w:rPr>
+            </w:pPr>
+          </w:p>
+          <w:p>
+            <w:pPr>
+              <w:jc w:val="center"/>
+              <w:rPr>
+                <w:rFonts w:ascii="Arial" w:hAnsi="Arial"/>
+                <w:sz w:val="22"/>
+                <w:szCs w:val="22"/>
+              </w:rPr>
+            </w:pPr>
+          </w:p>
+          <w:p>
+            <w:pPr>
+              <w:jc w:val="center"/>
+              <w:rPr>
+                <w:rFonts w:ascii="Arial" w:hAnsi="Arial"/>
+                <w:sz w:val="22"/>
+                <w:szCs w:val="22"/>
+              </w:rPr>
+            </w:pPr>
+          </w:p>
           <w:p>
             <w:pPr>
               <w:jc w:val="left"/>
@@ -2388,7 +2470,7 @@
           </w:p>
           <w:p>
             <w:pPr>
-              <w:jc w:val="left"/>
+              <w:jc w:val="center"/>
               <w:rPr>
                 <w:rFonts w:ascii="Arial" w:hAnsi="Arial"/>
                 <w:sz w:val="22"/>
@@ -2398,7 +2480,7 @@
           </w:p>
           <w:p>
             <w:pPr>
-              <w:jc w:val="left"/>
+              <w:jc w:val="center"/>
               <w:rPr>
                 <w:rFonts w:ascii="Arial" w:hAnsi="Arial"/>
                 <w:sz w:val="22"/>
@@ -2408,7 +2490,7 @@
           </w:p>
           <w:p>
             <w:pPr>
-              <w:jc w:val="left"/>
+              <w:jc w:val="center"/>
               <w:rPr>
                 <w:rFonts w:ascii="Arial" w:hAnsi="Arial"/>
                 <w:sz w:val="22"/>
@@ -2416,29 +2498,100 @@
               </w:rPr>
             </w:pPr>
           </w:p>
-          <w:p>
-            <w:pPr>
-              <w:jc w:val="left"/>
+        </w:tc>
+        <w:tc>
+          <w:tcPr>
+            <w:tcW w:w="2937" w:type="dxa"/>
+            <w:vAlign w:val="center"/>
+          </w:tcPr>
+          <w:p>
+            <w:pPr>
+              <w:jc w:val="center"/>
               <w:rPr>
                 <w:rFonts w:ascii="Arial" w:hAnsi="Arial"/>
                 <w:sz w:val="22"/>
                 <w:szCs w:val="22"/>
               </w:rPr>
             </w:pPr>
-            <w:r>
+          </w:p>
+        </w:tc>
+        <w:tc>
+          <w:tcPr>
+            <w:tcW w:w="4065" w:type="dxa"/>
+            <w:shd w:val="clear" w:color="auto" w:fill="auto"/>
+            <w:vAlign w:val="center"/>
+          </w:tcPr>
+          <w:p>
+            <w:pPr>
+              <w:jc w:val="center"/>
               <w:rPr>
                 <w:rFonts w:ascii="Arial" w:hAnsi="Arial"/>
                 <w:sz w:val="22"/>
                 <w:szCs w:val="22"/>
               </w:rPr>
+            </w:pPr>
+            <w:r>
+              <w:rPr>
+                <w:rFonts w:ascii="Arial" w:hAnsi="Arial"/>
+              </w:rPr>
               <w:t>${</w:t>
             </w:r>
             <w:proofErr w:type="spellStart"/>
             <w:r>
               <w:rPr>
                 <w:rFonts w:ascii="Arial" w:hAnsi="Arial"/>
-                <w:sz w:val="22"/>
-                <w:szCs w:val="22"/>
+              </w:rPr>
+              <w:t>qr</w:t>
+            </w:r>
+            <w:proofErr w:type="spellEnd"/>
+            <w:r>
+              <w:rPr>
+                <w:rFonts w:ascii="Arial" w:hAnsi="Arial"/>
+              </w:rPr>
+              <w:t>}</w:t>
+            </w:r>
+            <w:r>
+              <w:rPr>
+                <w:rFonts w:ascii="Arial" w:hAnsi="Arial"/>
+                <w:color w:val="FFFFFF"/>
+                <w:sz w:val="2"/>
+              </w:rPr>
+              <w:t>~</w:t>
+            </w:r>
+          </w:p>
+        </w:tc>
+      </w:tr>
+      <w:tr>
+        <w:tc>
+          <w:tcPr>
+            <w:tcW w:w="2403" w:type="dxa"/>
+            <w:shd w:val="clear" w:color="auto" w:fill="auto"/>
+            <w:vAlign w:val="center"/>
+          </w:tcPr>
+          <w:p>
+            <w:pPr>
+              <w:jc w:val="center"/>
+              <w:rPr>
+                <w:rFonts w:ascii="Arial" w:hAnsi="Arial"/>
+                <w:b/>
+                <w:sz w:val="22"/>
+                <w:szCs w:val="22"/>
+              </w:rPr>
+            </w:pPr>
+            <w:r>
+              <w:rPr>
+                <w:rFonts w:ascii="Arial" w:hAnsi="Arial"/>
+                <w:b/>
+                <w:sz w:val="22"/>
+              </w:rPr>
+              <w:t>${</w:t>
+            </w:r>
+            <w:proofErr w:type="spellStart"/>
+            <w:r>
+              <w:rPr>
+                <w:rFonts w:ascii="Arial" w:hAnsi="Arial"/>
+                <w:b/>
+                <w:sz w:val="22"/>
               </w:rPr>
               <w:t>surat_nama</w:t>
             </w:r>
@@ -2446,8 +2599,8 @@
             <w:r>
               <w:rPr>
                 <w:rFonts w:ascii="Arial" w:hAnsi="Arial"/>
-                <w:sz w:val="22"/>
-                <w:szCs w:val="22"/>
+                <w:b/>
+                <w:sz w:val="22"/>
               </w:rPr>
               <w:t>}</w:t>
             </w:r>
@@ -2456,21 +2609,41 @@
         <w:tc>
           <w:tcPr>
             <w:tcW w:w="2937" w:type="dxa"/>
+            <w:vAlign w:val="center"/>
           </w:tcPr>
           <w:p>
             <w:pPr>
               <w:jc w:val="center"/>
               <w:rPr>
                 <w:rFonts w:ascii="Arial" w:hAnsi="Arial"/>
-                <w:sz w:val="22"/>
-                <w:szCs w:val="22"/>
-              </w:rPr>
-            </w:pPr>
-            <w:r>
-              <w:rPr>
-                <w:rFonts w:ascii="Arial" w:hAnsi="Arial" w:cs="Arial"/>
-                <w:sz w:val="22"/>
-                <w:szCs w:val="22"/>
+              </w:rPr>
+            </w:pPr>
+          </w:p>
+        </w:tc>
+        <w:tc>
+          <w:tcPr>
+            <w:tcW w:w="4065" w:type="dxa"/>
+            <w:shd w:val="clear" w:color="auto" w:fill="auto"/>
+            <w:vAlign w:val="center"/>
+          </w:tcPr>
+          <w:p>
+            <w:pPr>
+              <w:jc w:val="center"/>
+              <w:rPr>
+                <w:rFonts w:ascii="Arial" w:hAnsi="Arial" w:cs="Arial"/>
+                <w:b/>
+                <w:sz w:val="22"/>
+                <w:szCs w:val="22"/>
+                <w:u w:val="single"/>
+              </w:rPr>
+            </w:pPr>
+            <w:r>
+              <w:rPr>
+                <w:rFonts w:ascii="Arial" w:hAnsi="Arial" w:cs="Arial"/>
+                <w:b/>
+                <w:sz w:val="22"/>
+                <w:szCs w:val="22"/>
+                <w:u w:val="single"/>
               </w:rPr>
               <w:t>${</w:t>
             </w:r>
@@ -2478,87 +2651,79 @@
             <w:r>
               <w:rPr>
                 <w:rFonts w:ascii="Arial" w:hAnsi="Arial" w:cs="Arial"/>
-                <w:sz w:val="22"/>
-                <w:szCs w:val="22"/>
-              </w:rPr>
-              <w:t>qr</w:t>
+                <w:b/>
+                <w:sz w:val="22"/>
+                <w:szCs w:val="22"/>
+                <w:u w:val="single"/>
+              </w:rPr>
+              <w:t>skpd_kepala</w:t>
             </w:r>
             <w:proofErr w:type="spellEnd"/>
             <w:r>
               <w:rPr>
                 <w:rFonts w:ascii="Arial" w:hAnsi="Arial" w:cs="Arial"/>
-                <w:sz w:val="22"/>
-                <w:szCs w:val="22"/>
+                <w:b/>
+                <w:sz w:val="22"/>
+                <w:szCs w:val="22"/>
+                <w:u w:val="single"/>
               </w:rPr>
               <w:t>}</w:t>
             </w:r>
           </w:p>
-        </w:tc>
-        <w:tc>
-          <w:tcPr>
-            <w:tcW w:w="4065" w:type="dxa"/>
-          </w:tcPr>
-          <w:p>
-            <w:pPr>
+          <w:p>
+            <w:pPr>
+              <w:jc w:val="center"/>
               <w:rPr>
                 <w:rFonts w:ascii="Arial" w:hAnsi="Arial"/>
-                <w:sz w:val="22"/>
-                <w:szCs w:val="22"/>
-              </w:rPr>
-            </w:pPr>
-          </w:p>
-          <w:p>
-            <w:pPr>
-              <w:rPr>
-                <w:rFonts w:ascii="Arial" w:hAnsi="Arial"/>
-                <w:sz w:val="22"/>
-                <w:szCs w:val="22"/>
-              </w:rPr>
-            </w:pPr>
-          </w:p>
-          <w:p>
-            <w:pPr>
-              <w:rPr>
-                <w:rFonts w:ascii="Arial" w:hAnsi="Arial"/>
-                <w:sz w:val="22"/>
-                <w:szCs w:val="22"/>
-              </w:rPr>
-            </w:pPr>
-          </w:p>
-          <w:p>
-            <w:pPr>
-              <w:rPr>
-                <w:rFonts w:ascii="Arial" w:hAnsi="Arial"/>
-                <w:sz w:val="22"/>
-                <w:szCs w:val="22"/>
-              </w:rPr>
-            </w:pPr>
-            <w:r>
-              <w:rPr>
-                <w:rFonts w:ascii="Arial" w:hAnsi="Arial"/>
-                <w:sz w:val="22"/>
-                <w:szCs w:val="22"/>
-              </w:rPr>
-              <w:t>~</w:t>
-            </w:r>
-          </w:p>
-          <w:p>
-            <w:pPr>
-              <w:rPr>
-                <w:rFonts w:ascii="Arial" w:hAnsi="Arial"/>
-                <w:sz w:val="22"/>
-                <w:szCs w:val="22"/>
-              </w:rPr>
-            </w:pPr>
-          </w:p>
-          <w:p>
-            <w:pPr>
-              <w:rPr>
-                <w:rFonts w:ascii="Arial" w:hAnsi="Arial"/>
-                <w:sz w:val="22"/>
-                <w:szCs w:val="22"/>
-              </w:rPr>
-            </w:pPr>
+                <w:color w:val="FFFFFF"/>
+                <w:sz w:val="2"/>
+              </w:rPr>
+            </w:pPr>
+            <w:r>
+              <w:rPr>
+                <w:rFonts w:ascii="Arial" w:eastAsia="Arial" w:hAnsi="Arial"/>
+              </w:rPr>
+              <w:t xml:space="preserve">NIP. </w:t>
+            </w:r>
+            <w:bookmarkStart w:id="0" w:name="_GoBack"/>
+            <w:bookmarkEnd w:id="0"/>
+            <w:r>
+              <w:rPr>
+                <w:rFonts w:ascii="Arial" w:hAnsi="Arial" w:cs="Arial"/>
+                <w:b/>
+                <w:sz w:val="22"/>
+                <w:szCs w:val="22"/>
+              </w:rPr>
+              <w:t>${</w:t>
+            </w:r>
+            <w:proofErr w:type="spellStart"/>
+            <w:r>
+              <w:rPr>
+                <w:rFonts w:ascii="Arial" w:hAnsi="Arial" w:cs="Arial"/>
+                <w:b/>
+                <w:sz w:val="22"/>
+                <w:szCs w:val="22"/>
+              </w:rPr>
+              <w:t>skpd_nip_kepala</w:t>
+            </w:r>
+            <w:proofErr w:type="spellEnd"/>
+            <w:r>
+              <w:rPr>
+                <w:rFonts w:ascii="Arial" w:hAnsi="Arial" w:cs="Arial"/>
+                <w:b/>
+                <w:sz w:val="22"/>
+                <w:szCs w:val="22"/>
+              </w:rPr>
+              <w:t>}</w:t>
+            </w:r>
+            <w:r>
+              <w:rPr>
+                <w:rFonts w:ascii="Arial" w:hAnsi="Arial" w:cs="Arial"/>
+                <w:sz w:val="22"/>
+                <w:szCs w:val="22"/>
+              </w:rPr>
+              <w:br/>
+            </w:r>
           </w:p>
         </w:tc>
       </w:tr>
@@ -2587,7 +2752,7 @@
 </file>
 
 <file path=word/endnotes.xml><?xml version="1.0" encoding="utf-8"?>
-<w:endnotes xmlns:wpc="http://schemas.microsoft.com/office/word/2010/wordprocessingCanvas" xmlns:cx="http://schemas.microsoft.com/office/drawing/2014/chartex" xmlns:cx1="http://schemas.microsoft.com/office/drawing/2015/9/8/chartex" xmlns:cx2="http://schemas.microsoft.com/office/drawing/2015/10/21/chartex" xmlns:cx3="http://schemas.microsoft.com/office/drawing/2016/5/9/chartex" xmlns:cx4="http://schemas.microsoft.com/office/drawing/2016/5/10/chartex" xmlns:cx5="http://schemas.microsoft.com/office/drawing/2016/5/11/chartex" xmlns:cx6="http://schemas.microsoft.com/office/drawing/2016/5/12/chartex" xmlns:cx7="http://schemas.microsoft.com/office/drawing/2016/5/13/chartex" xmlns:cx8="http://schemas.microsoft.com/office/drawing/2016/5/14/chartex" xmlns:mc="http://schemas.openxmlformats.org/markup-compatibility/2006" xmlns:aink="http://schemas.microsoft.com/office/drawing/2016/ink" xmlns:am3d="http://schemas.microsoft.com/office/drawing/2017/model3d" xmlns:o="urn:schemas-microsoft-com:office:office" xmlns:oel="http://schemas.microsoft.com/office/2019/extlst" xmlns:r="http://schemas.openxmlformats.org/officeDocument/2006/relationships" xmlns:m="http://schemas.openxmlformats.org/officeDocument/2006/math" xmlns:v="urn:schemas-microsoft-com:vml" xmlns:wp14="http://schemas.microsoft.com/office/word/2010/wordprocessingDrawing" xmlns:wp="http://schemas.openxmlformats.org/drawingml/2006/wordprocessingDrawing" xmlns:w10="urn:schemas-microsoft-com:office:word" xmlns:w="http://schemas.openxmlformats.org/wordprocessingml/2006/main" xmlns:w14="http://schemas.microsoft.com/office/word/2010/wordml" xmlns:w15="http://schemas.microsoft.com/office/word/2012/wordml" xmlns:w16cex="http://schemas.microsoft.com/office/word/2018/wordml/cex" xmlns:w16cid="http://schemas.microsoft.com/office/word/2016/wordml/cid" xmlns:w16="http://schemas.microsoft.com/office/word/2018/wordml" xmlns:w16du="http://schemas.microsoft.com/office/word/2023/wordml/word16du" xmlns:w16sdtdh="http://schemas.microsoft.com/office/word/2020/wordml/sdtdatahash" xmlns:w16sdtfl="http://schemas.microsoft.com/office/word/2024/wordml/sdtformatlock" xmlns:w16se="http://schemas.microsoft.com/office/word/2015/wordml/symex" xmlns:wpg="http://schemas.microsoft.com/office/word/2010/wordprocessingGroup" xmlns:wpi="http://schemas.microsoft.com/office/word/2010/wordprocessingInk" xmlns:wne="http://schemas.microsoft.com/office/word/2006/wordml" xmlns:wps="http://schemas.microsoft.com/office/word/2010/wordprocessingShape" mc:Ignorable="w14 w15 w16se w16cid w16 w16cex w16sdtdh w16sdtfl w16du wp14">
+<w:endnotes xmlns:wpc="http://schemas.microsoft.com/office/word/2010/wordprocessingCanvas" xmlns:mc="http://schemas.openxmlformats.org/markup-compatibility/2006" xmlns:o="urn:schemas-microsoft-com:office:office" xmlns:r="http://schemas.openxmlformats.org/officeDocument/2006/relationships" xmlns:m="http://schemas.openxmlformats.org/officeDocument/2006/math" xmlns:v="urn:schemas-microsoft-com:vml" xmlns:wp14="http://schemas.microsoft.com/office/word/2010/wordprocessingDrawing" xmlns:wp="http://schemas.openxmlformats.org/drawingml/2006/wordprocessingDrawing" xmlns:w10="urn:schemas-microsoft-com:office:word" xmlns:w="http://schemas.openxmlformats.org/wordprocessingml/2006/main" xmlns:w14="http://schemas.microsoft.com/office/word/2010/wordml" xmlns:w15="http://schemas.microsoft.com/office/word/2012/wordml" xmlns:wpg="http://schemas.microsoft.com/office/word/2010/wordprocessingGroup" xmlns:wpi="http://schemas.microsoft.com/office/word/2010/wordprocessingInk" xmlns:wne="http://schemas.microsoft.com/office/word/2006/wordml" xmlns:wps="http://schemas.microsoft.com/office/word/2010/wordprocessingShape" mc:Ignorable="w14 w15 wp14">
   <w:endnote w:type="separator" w:id="-1">
     <w:p>
       <w:r>
@@ -2606,7 +2771,7 @@
 </file>
 
 <file path=word/footer1.xml><?xml version="1.0" encoding="utf-8"?>
-<w:ftr xmlns:wpc="http://schemas.microsoft.com/office/word/2010/wordprocessingCanvas" xmlns:cx="http://schemas.microsoft.com/office/drawing/2014/chartex" xmlns:cx1="http://schemas.microsoft.com/office/drawing/2015/9/8/chartex" xmlns:cx2="http://schemas.microsoft.com/office/drawing/2015/10/21/chartex" xmlns:cx3="http://schemas.microsoft.com/office/drawing/2016/5/9/chartex" xmlns:cx4="http://schemas.microsoft.com/office/drawing/2016/5/10/chartex" xmlns:cx5="http://schemas.microsoft.com/office/drawing/2016/5/11/chartex" xmlns:cx6="http://schemas.microsoft.com/office/drawing/2016/5/12/chartex" xmlns:cx7="http://schemas.microsoft.com/office/drawing/2016/5/13/chartex" xmlns:cx8="http://schemas.microsoft.com/office/drawing/2016/5/14/chartex" xmlns:mc="http://schemas.openxmlformats.org/markup-compatibility/2006" xmlns:aink="http://schemas.microsoft.com/office/drawing/2016/ink" xmlns:am3d="http://schemas.microsoft.com/office/drawing/2017/model3d" xmlns:o="urn:schemas-microsoft-com:office:office" xmlns:oel="http://schemas.microsoft.com/office/2019/extlst" xmlns:r="http://schemas.openxmlformats.org/officeDocument/2006/relationships" xmlns:m="http://schemas.openxmlformats.org/officeDocument/2006/math" xmlns:v="urn:schemas-microsoft-com:vml" xmlns:wp14="http://schemas.microsoft.com/office/word/2010/wordprocessingDrawing" xmlns:wp="http://schemas.openxmlformats.org/drawingml/2006/wordprocessingDrawing" xmlns:w10="urn:schemas-microsoft-com:office:word" xmlns:w="http://schemas.openxmlformats.org/wordprocessingml/2006/main" xmlns:w14="http://schemas.microsoft.com/office/word/2010/wordml" xmlns:w15="http://schemas.microsoft.com/office/word/2012/wordml" xmlns:w16cex="http://schemas.microsoft.com/office/word/2018/wordml/cex" xmlns:w16cid="http://schemas.microsoft.com/office/word/2016/wordml/cid" xmlns:w16="http://schemas.microsoft.com/office/word/2018/wordml" xmlns:w16du="http://schemas.microsoft.com/office/word/2023/wordml/word16du" xmlns:w16sdtdh="http://schemas.microsoft.com/office/word/2020/wordml/sdtdatahash" xmlns:w16sdtfl="http://schemas.microsoft.com/office/word/2024/wordml/sdtformatlock" xmlns:w16se="http://schemas.microsoft.com/office/word/2015/wordml/symex" xmlns:wpg="http://schemas.microsoft.com/office/word/2010/wordprocessingGroup" xmlns:wpi="http://schemas.microsoft.com/office/word/2010/wordprocessingInk" xmlns:wne="http://schemas.microsoft.com/office/word/2006/wordml" xmlns:wps="http://schemas.microsoft.com/office/word/2010/wordprocessingShape" mc:Ignorable="w14 w15 w16se w16cid w16 w16cex w16sdtdh w16sdtfl w16du wp14">
+<w:ftr xmlns:wpc="http://schemas.microsoft.com/office/word/2010/wordprocessingCanvas" xmlns:mc="http://schemas.openxmlformats.org/markup-compatibility/2006" xmlns:o="urn:schemas-microsoft-com:office:office" xmlns:r="http://schemas.openxmlformats.org/officeDocument/2006/relationships" xmlns:m="http://schemas.openxmlformats.org/officeDocument/2006/math" xmlns:v="urn:schemas-microsoft-com:vml" xmlns:wp14="http://schemas.microsoft.com/office/word/2010/wordprocessingDrawing" xmlns:wp="http://schemas.openxmlformats.org/drawingml/2006/wordprocessingDrawing" xmlns:w10="urn:schemas-microsoft-com:office:word" xmlns:w="http://schemas.openxmlformats.org/wordprocessingml/2006/main" xmlns:w14="http://schemas.microsoft.com/office/word/2010/wordml" xmlns:w15="http://schemas.microsoft.com/office/word/2012/wordml" xmlns:wpg="http://schemas.microsoft.com/office/word/2010/wordprocessingGroup" xmlns:wpi="http://schemas.microsoft.com/office/word/2010/wordprocessingInk" xmlns:wne="http://schemas.microsoft.com/office/word/2006/wordml" xmlns:wps="http://schemas.microsoft.com/office/word/2010/wordprocessingShape" mc:Ignorable="w14 w15 wp14">
   <w:p>
     <w:pPr>
       <w:pStyle w:val="Footer"/>
@@ -2614,6 +2779,7 @@
     <w:r>
       <w:rPr>
         <w:noProof/>
+        <w:lang w:val="en-ID" w:eastAsia="en-ID"/>
       </w:rPr>
       <w:drawing>
         <wp:anchor distT="0" distB="0" distL="0" distR="0" simplePos="0" relativeHeight="251659264" behindDoc="1" locked="0" layoutInCell="1" allowOverlap="1" wp14:anchorId="648C630B" wp14:editId="78C09A7F">
@@ -2667,7 +2833,7 @@
 </file>
 
 <file path=word/footnotes.xml><?xml version="1.0" encoding="utf-8"?>
-<w:footnotes xmlns:wpc="http://schemas.microsoft.com/office/word/2010/wordprocessingCanvas" xmlns:cx="http://schemas.microsoft.com/office/drawing/2014/chartex" xmlns:cx1="http://schemas.microsoft.com/office/drawing/2015/9/8/chartex" xmlns:cx2="http://schemas.microsoft.com/office/drawing/2015/10/21/chartex" xmlns:cx3="http://schemas.microsoft.com/office/drawing/2016/5/9/chartex" xmlns:cx4="http://schemas.microsoft.com/office/drawing/2016/5/10/chartex" xmlns:cx5="http://schemas.microsoft.com/office/drawing/2016/5/11/chartex" xmlns:cx6="http://schemas.microsoft.com/office/drawing/2016/5/12/chartex" xmlns:cx7="http://schemas.microsoft.com/office/drawing/2016/5/13/chartex" xmlns:cx8="http://schemas.microsoft.com/office/drawing/2016/5/14/chartex" xmlns:mc="http://schemas.openxmlformats.org/markup-compatibility/2006" xmlns:aink="http://schemas.microsoft.com/office/drawing/2016/ink" xmlns:am3d="http://schemas.microsoft.com/office/drawing/2017/model3d" xmlns:o="urn:schemas-microsoft-com:office:office" xmlns:oel="http://schemas.microsoft.com/office/2019/extlst" xmlns:r="http://schemas.openxmlformats.org/officeDocument/2006/relationships" xmlns:m="http://schemas.openxmlformats.org/officeDocument/2006/math" xmlns:v="urn:schemas-microsoft-com:vml" xmlns:wp14="http://schemas.microsoft.com/office/word/2010/wordprocessingDrawing" xmlns:wp="http://schemas.openxmlformats.org/drawingml/2006/wordprocessingDrawing" xmlns:w10="urn:schemas-microsoft-com:office:word" xmlns:w="http://schemas.openxmlformats.org/wordprocessingml/2006/main" xmlns:w14="http://schemas.microsoft.com/office/word/2010/wordml" xmlns:w15="http://schemas.microsoft.com/office/word/2012/wordml" xmlns:w16cex="http://schemas.microsoft.com/office/word/2018/wordml/cex" xmlns:w16cid="http://schemas.microsoft.com/office/word/2016/wordml/cid" xmlns:w16="http://schemas.microsoft.com/office/word/2018/wordml" xmlns:w16du="http://schemas.microsoft.com/office/word/2023/wordml/word16du" xmlns:w16sdtdh="http://schemas.microsoft.com/office/word/2020/wordml/sdtdatahash" xmlns:w16sdtfl="http://schemas.microsoft.com/office/word/2024/wordml/sdtformatlock" xmlns:w16se="http://schemas.microsoft.com/office/word/2015/wordml/symex" xmlns:wpg="http://schemas.microsoft.com/office/word/2010/wordprocessingGroup" xmlns:wpi="http://schemas.microsoft.com/office/word/2010/wordprocessingInk" xmlns:wne="http://schemas.microsoft.com/office/word/2006/wordml" xmlns:wps="http://schemas.microsoft.com/office/word/2010/wordprocessingShape" mc:Ignorable="w14 w15 w16se w16cid w16 w16cex w16sdtdh w16sdtfl w16du wp14">
+<w:footnotes xmlns:wpc="http://schemas.microsoft.com/office/word/2010/wordprocessingCanvas" xmlns:mc="http://schemas.openxmlformats.org/markup-compatibility/2006" xmlns:o="urn:schemas-microsoft-com:office:office" xmlns:r="http://schemas.openxmlformats.org/officeDocument/2006/relationships" xmlns:m="http://schemas.openxmlformats.org/officeDocument/2006/math" xmlns:v="urn:schemas-microsoft-com:vml" xmlns:wp14="http://schemas.microsoft.com/office/word/2010/wordprocessingDrawing" xmlns:wp="http://schemas.openxmlformats.org/drawingml/2006/wordprocessingDrawing" xmlns:w10="urn:schemas-microsoft-com:office:word" xmlns:w="http://schemas.openxmlformats.org/wordprocessingml/2006/main" xmlns:w14="http://schemas.microsoft.com/office/word/2010/wordml" xmlns:w15="http://schemas.microsoft.com/office/word/2012/wordml" xmlns:wpg="http://schemas.microsoft.com/office/word/2010/wordprocessingGroup" xmlns:wpi="http://schemas.microsoft.com/office/word/2010/wordprocessingInk" xmlns:wne="http://schemas.microsoft.com/office/word/2006/wordml" xmlns:wps="http://schemas.microsoft.com/office/word/2010/wordprocessingShape" mc:Ignorable="w14 w15 wp14">
   <w:footnote w:type="separator" w:id="-1">
     <w:p>
       <w:r>
@@ -2686,7 +2852,7 @@
 </file>
 
 <file path=word/header1.xml><?xml version="1.0" encoding="utf-8"?>
-<w:hdr xmlns:wpc="http://schemas.microsoft.com/office/word/2010/wordprocessingCanvas" xmlns:cx="http://schemas.microsoft.com/office/drawing/2014/chartex" xmlns:cx1="http://schemas.microsoft.com/office/drawing/2015/9/8/chartex" xmlns:cx2="http://schemas.microsoft.com/office/drawing/2015/10/21/chartex" xmlns:cx3="http://schemas.microsoft.com/office/drawing/2016/5/9/chartex" xmlns:cx4="http://schemas.microsoft.com/office/drawing/2016/5/10/chartex" xmlns:cx5="http://schemas.microsoft.com/office/drawing/2016/5/11/chartex" xmlns:cx6="http://schemas.microsoft.com/office/drawing/2016/5/12/chartex" xmlns:cx7="http://schemas.microsoft.com/office/drawing/2016/5/13/chartex" xmlns:cx8="http://schemas.microsoft.com/office/drawing/2016/5/14/chartex" xmlns:mc="http://schemas.openxmlformats.org/markup-compatibility/2006" xmlns:aink="http://schemas.microsoft.com/office/drawing/2016/ink" xmlns:am3d="http://schemas.microsoft.com/office/drawing/2017/model3d" xmlns:o="urn:schemas-microsoft-com:office:office" xmlns:oel="http://schemas.microsoft.com/office/2019/extlst" xmlns:r="http://schemas.openxmlformats.org/officeDocument/2006/relationships" xmlns:m="http://schemas.openxmlformats.org/officeDocument/2006/math" xmlns:v="urn:schemas-microsoft-com:vml" xmlns:wp14="http://schemas.microsoft.com/office/word/2010/wordprocessingDrawing" xmlns:wp="http://schemas.openxmlformats.org/drawingml/2006/wordprocessingDrawing" xmlns:w10="urn:schemas-microsoft-com:office:word" xmlns:w="http://schemas.openxmlformats.org/wordprocessingml/2006/main" xmlns:w14="http://schemas.microsoft.com/office/word/2010/wordml" xmlns:w15="http://schemas.microsoft.com/office/word/2012/wordml" xmlns:w16cex="http://schemas.microsoft.com/office/word/2018/wordml/cex" xmlns:w16cid="http://schemas.microsoft.com/office/word/2016/wordml/cid" xmlns:w16="http://schemas.microsoft.com/office/word/2018/wordml" xmlns:w16du="http://schemas.microsoft.com/office/word/2023/wordml/word16du" xmlns:w16sdtdh="http://schemas.microsoft.com/office/word/2020/wordml/sdtdatahash" xmlns:w16sdtfl="http://schemas.microsoft.com/office/word/2024/wordml/sdtformatlock" xmlns:w16se="http://schemas.microsoft.com/office/word/2015/wordml/symex" xmlns:wpg="http://schemas.microsoft.com/office/word/2010/wordprocessingGroup" xmlns:wpi="http://schemas.microsoft.com/office/word/2010/wordprocessingInk" xmlns:wne="http://schemas.microsoft.com/office/word/2006/wordml" xmlns:wps="http://schemas.microsoft.com/office/word/2010/wordprocessingShape" mc:Ignorable="w14 w15 w16se w16cid w16 w16cex w16sdtdh w16sdtfl w16du wp14">
+<w:hdr xmlns:wpc="http://schemas.microsoft.com/office/word/2010/wordprocessingCanvas" xmlns:mc="http://schemas.openxmlformats.org/markup-compatibility/2006" xmlns:o="urn:schemas-microsoft-com:office:office" xmlns:r="http://schemas.openxmlformats.org/officeDocument/2006/relationships" xmlns:m="http://schemas.openxmlformats.org/officeDocument/2006/math" xmlns:v="urn:schemas-microsoft-com:vml" xmlns:wp14="http://schemas.microsoft.com/office/word/2010/wordprocessingDrawing" xmlns:wp="http://schemas.openxmlformats.org/drawingml/2006/wordprocessingDrawing" xmlns:w10="urn:schemas-microsoft-com:office:word" xmlns:w="http://schemas.openxmlformats.org/wordprocessingml/2006/main" xmlns:w14="http://schemas.microsoft.com/office/word/2010/wordml" xmlns:w15="http://schemas.microsoft.com/office/word/2012/wordml" xmlns:wpg="http://schemas.microsoft.com/office/word/2010/wordprocessingGroup" xmlns:wpi="http://schemas.microsoft.com/office/word/2010/wordprocessingInk" xmlns:wne="http://schemas.microsoft.com/office/word/2006/wordml" xmlns:wps="http://schemas.microsoft.com/office/word/2010/wordprocessingShape" mc:Ignorable="w14 w15 wp14">
   <w:tbl>
     <w:tblPr>
       <w:tblStyle w:val="TableGrid"/>
@@ -2722,6 +2888,7 @@
             <w:rPr>
               <w:rFonts w:ascii="Arial" w:hAnsi="Arial" w:cs="Arial"/>
               <w:noProof/>
+              <w:lang w:val="en-ID" w:eastAsia="en-ID"/>
             </w:rPr>
             <w:drawing>
               <wp:inline distT="0" distB="0" distL="114300" distR="114300" wp14:anchorId="084C71D6" wp14:editId="77B7E300">
@@ -2955,7 +3122,25 @@
               <w:sz w:val="24"/>
               <w:szCs w:val="24"/>
             </w:rPr>
-            <w:t>} Telp. ${</w:t>
+            <w:t xml:space="preserve">} </w:t>
+          </w:r>
+          <w:proofErr w:type="spellStart"/>
+          <w:r>
+            <w:rPr>
+              <w:rFonts w:ascii="Arial" w:hAnsi="Arial" w:cs="Arial"/>
+              <w:sz w:val="24"/>
+              <w:szCs w:val="24"/>
+            </w:rPr>
+            <w:t>Telp</w:t>
+          </w:r>
+          <w:proofErr w:type="spellEnd"/>
+          <w:r>
+            <w:rPr>
+              <w:rFonts w:ascii="Arial" w:hAnsi="Arial" w:cs="Arial"/>
+              <w:sz w:val="24"/>
+              <w:szCs w:val="24"/>
+            </w:rPr>
+            <w:t>. ${</w:t>
           </w:r>
           <w:proofErr w:type="spellStart"/>
           <w:r>
@@ -2973,7 +3158,43 @@
               <w:sz w:val="24"/>
               <w:szCs w:val="24"/>
             </w:rPr>
-            <w:t>} Kode Pos ${</w:t>
+            <w:t xml:space="preserve">} </w:t>
+          </w:r>
+          <w:proofErr w:type="spellStart"/>
+          <w:r>
+            <w:rPr>
+              <w:rFonts w:ascii="Arial" w:hAnsi="Arial" w:cs="Arial"/>
+              <w:sz w:val="24"/>
+              <w:szCs w:val="24"/>
+            </w:rPr>
+            <w:t>Kode</w:t>
+          </w:r>
+          <w:proofErr w:type="spellEnd"/>
+          <w:r>
+            <w:rPr>
+              <w:rFonts w:ascii="Arial" w:hAnsi="Arial" w:cs="Arial"/>
+              <w:sz w:val="24"/>
+              <w:szCs w:val="24"/>
+            </w:rPr>
+            <w:t xml:space="preserve"> </w:t>
+          </w:r>
+          <w:proofErr w:type="spellStart"/>
+          <w:r>
+            <w:rPr>
+              <w:rFonts w:ascii="Arial" w:hAnsi="Arial" w:cs="Arial"/>
+              <w:sz w:val="24"/>
+              <w:szCs w:val="24"/>
+            </w:rPr>
+            <w:t>Pos</w:t>
+          </w:r>
+          <w:proofErr w:type="spellEnd"/>
+          <w:r>
+            <w:rPr>
+              <w:rFonts w:ascii="Arial" w:hAnsi="Arial" w:cs="Arial"/>
+              <w:sz w:val="24"/>
+              <w:szCs w:val="24"/>
+            </w:rPr>
+            <w:t xml:space="preserve"> ${</w:t>
           </w:r>
           <w:proofErr w:type="spellStart"/>
           <w:r>
@@ -3043,7 +3264,7 @@
 </file>
 
 <file path=word/numbering.xml><?xml version="1.0" encoding="utf-8"?>
-<w:numbering xmlns:wpc="http://schemas.microsoft.com/office/word/2010/wordprocessingCanvas" xmlns:cx="http://schemas.microsoft.com/office/drawing/2014/chartex" xmlns:cx1="http://schemas.microsoft.com/office/drawing/2015/9/8/chartex" xmlns:cx2="http://schemas.microsoft.com/office/drawing/2015/10/21/chartex" xmlns:cx3="http://schemas.microsoft.com/office/drawing/2016/5/9/chartex" xmlns:cx4="http://schemas.microsoft.com/office/drawing/2016/5/10/chartex" xmlns:cx5="http://schemas.microsoft.com/office/drawing/2016/5/11/chartex" xmlns:cx6="http://schemas.microsoft.com/office/drawing/2016/5/12/chartex" xmlns:cx7="http://schemas.microsoft.com/office/drawing/2016/5/13/chartex" xmlns:cx8="http://schemas.microsoft.com/office/drawing/2016/5/14/chartex" xmlns:mc="http://schemas.openxmlformats.org/markup-compatibility/2006" xmlns:aink="http://schemas.microsoft.com/office/drawing/2016/ink" xmlns:am3d="http://schemas.microsoft.com/office/drawing/2017/model3d" xmlns:o="urn:schemas-microsoft-com:office:office" xmlns:oel="http://schemas.microsoft.com/office/2019/extlst" xmlns:r="http://schemas.openxmlformats.org/officeDocument/2006/relationships" xmlns:m="http://schemas.openxmlformats.org/officeDocument/2006/math" xmlns:v="urn:schemas-microsoft-com:vml" xmlns:wp14="http://schemas.microsoft.com/office/word/2010/wordprocessingDrawing" xmlns:wp="http://schemas.openxmlformats.org/drawingml/2006/wordprocessingDrawing" xmlns:w10="urn:schemas-microsoft-com:office:word" xmlns:w="http://schemas.openxmlformats.org/wordprocessingml/2006/main" xmlns:w14="http://schemas.microsoft.com/office/word/2010/wordml" xmlns:w15="http://schemas.microsoft.com/office/word/2012/wordml" xmlns:w16cex="http://schemas.microsoft.com/office/word/2018/wordml/cex" xmlns:w16cid="http://schemas.microsoft.com/office/word/2016/wordml/cid" xmlns:w16="http://schemas.microsoft.com/office/word/2018/wordml" xmlns:w16du="http://schemas.microsoft.com/office/word/2023/wordml/word16du" xmlns:w16sdtdh="http://schemas.microsoft.com/office/word/2020/wordml/sdtdatahash" xmlns:w16sdtfl="http://schemas.microsoft.com/office/word/2024/wordml/sdtformatlock" xmlns:w16se="http://schemas.microsoft.com/office/word/2015/wordml/symex" xmlns:wpg="http://schemas.microsoft.com/office/word/2010/wordprocessingGroup" xmlns:wpi="http://schemas.microsoft.com/office/word/2010/wordprocessingInk" xmlns:wne="http://schemas.microsoft.com/office/word/2006/wordml" xmlns:wps="http://schemas.microsoft.com/office/word/2010/wordprocessingShape" mc:Ignorable="w14 w15 w16se w16cid w16 w16cex w16sdtdh w16sdtfl w16du wp14">
+<w:numbering xmlns:wpc="http://schemas.microsoft.com/office/word/2010/wordprocessingCanvas" xmlns:mc="http://schemas.openxmlformats.org/markup-compatibility/2006" xmlns:o="urn:schemas-microsoft-com:office:office" xmlns:r="http://schemas.openxmlformats.org/officeDocument/2006/relationships" xmlns:m="http://schemas.openxmlformats.org/officeDocument/2006/math" xmlns:v="urn:schemas-microsoft-com:vml" xmlns:wp14="http://schemas.microsoft.com/office/word/2010/wordprocessingDrawing" xmlns:wp="http://schemas.openxmlformats.org/drawingml/2006/wordprocessingDrawing" xmlns:w10="urn:schemas-microsoft-com:office:word" xmlns:w="http://schemas.openxmlformats.org/wordprocessingml/2006/main" xmlns:w14="http://schemas.microsoft.com/office/word/2010/wordml" xmlns:w15="http://schemas.microsoft.com/office/word/2012/wordml" xmlns:wpg="http://schemas.microsoft.com/office/word/2010/wordprocessingGroup" xmlns:wpi="http://schemas.microsoft.com/office/word/2010/wordprocessingInk" xmlns:wne="http://schemas.microsoft.com/office/word/2006/wordml" xmlns:wps="http://schemas.microsoft.com/office/word/2010/wordprocessingShape" mc:Ignorable="w14 w15 wp14">
   <w:abstractNum w:abstractNumId="0" w15:restartNumberingAfterBreak="0">
     <w:nsid w:val="E49AA65F"/>
     <w:multiLevelType w:val="multilevel"/>
@@ -3188,17 +3409,17 @@
       <w:lvlJc w:val="left"/>
     </w:lvl>
   </w:abstractNum>
-  <w:num w:numId="1" w16cid:durableId="1234657063">
+  <w:num w:numId="1">
     <w:abstractNumId w:val="0"/>
   </w:num>
-  <w:num w:numId="2" w16cid:durableId="1001466618">
+  <w:num w:numId="2">
     <w:abstractNumId w:val="1"/>
   </w:num>
 </w:numbering>
 </file>
 
 <file path=word/styles.xml><?xml version="1.0" encoding="utf-8"?>
-<w:styles xmlns:mc="http://schemas.openxmlformats.org/markup-compatibility/2006" xmlns:r="http://schemas.openxmlformats.org/officeDocument/2006/relationships" xmlns:w="http://schemas.openxmlformats.org/wordprocessingml/2006/main" xmlns:w14="http://schemas.microsoft.com/office/word/2010/wordml" xmlns:w15="http://schemas.microsoft.com/office/word/2012/wordml" xmlns:w16cex="http://schemas.microsoft.com/office/word/2018/wordml/cex" xmlns:w16cid="http://schemas.microsoft.com/office/word/2016/wordml/cid" xmlns:w16="http://schemas.microsoft.com/office/word/2018/wordml" xmlns:w16du="http://schemas.microsoft.com/office/word/2023/wordml/word16du" xmlns:w16sdtdh="http://schemas.microsoft.com/office/word/2020/wordml/sdtdatahash" xmlns:w16sdtfl="http://schemas.microsoft.com/office/word/2024/wordml/sdtformatlock" xmlns:w16se="http://schemas.microsoft.com/office/word/2015/wordml/symex" mc:Ignorable="w14 w15 w16se w16cid w16 w16cex w16sdtdh w16sdtfl w16du">
+<w:styles xmlns:mc="http://schemas.openxmlformats.org/markup-compatibility/2006" xmlns:r="http://schemas.openxmlformats.org/officeDocument/2006/relationships" xmlns:w="http://schemas.openxmlformats.org/wordprocessingml/2006/main" xmlns:w14="http://schemas.microsoft.com/office/word/2010/wordml" xmlns:w15="http://schemas.microsoft.com/office/word/2012/wordml" mc:Ignorable="w14 w15">
   <w:docDefaults>
     <w:rPrDefault>
       <w:rPr>
@@ -3208,7 +3429,7 @@
     </w:rPrDefault>
     <w:pPrDefault/>
   </w:docDefaults>
-  <w:latentStyles w:defLockedState="0" w:defUIPriority="0" w:defSemiHidden="0" w:defUnhideWhenUsed="0" w:defQFormat="0" w:count="376">
+  <w:latentStyles w:defLockedState="0" w:defUIPriority="0" w:defSemiHidden="0" w:defUnhideWhenUsed="0" w:defQFormat="0" w:count="371">
     <w:lsdException w:name="Normal" w:qFormat="1"/>
     <w:lsdException w:name="heading 1" w:qFormat="1"/>
     <w:lsdException w:name="heading 2" w:semiHidden="1" w:unhideWhenUsed="1" w:qFormat="1"/>
@@ -3493,11 +3714,6 @@
     <w:lsdException w:name="List Table 5 Dark Accent 6" w:uiPriority="50"/>
     <w:lsdException w:name="List Table 6 Colorful Accent 6" w:uiPriority="51"/>
     <w:lsdException w:name="List Table 7 Colorful Accent 6" w:uiPriority="52"/>
-    <w:lsdException w:name="Mention" w:semiHidden="1" w:uiPriority="99" w:unhideWhenUsed="1"/>
-    <w:lsdException w:name="Smart Hyperlink" w:semiHidden="1" w:uiPriority="99" w:unhideWhenUsed="1"/>
-    <w:lsdException w:name="Hashtag" w:semiHidden="1" w:uiPriority="99" w:unhideWhenUsed="1"/>
-    <w:lsdException w:name="Unresolved Mention" w:semiHidden="1" w:uiPriority="99" w:unhideWhenUsed="1"/>
-    <w:lsdException w:name="Smart Link" w:semiHidden="1" w:uiPriority="99" w:unhideWhenUsed="1"/>
   </w:latentStyles>
   <w:style w:type="paragraph" w:default="1" w:styleId="Normal">
     <w:name w:val="Normal"/>

</xml_diff>